<commit_message>
Proje_Durumu.docx: 3 yeni gorsel aciklamalariyla guncellendi
</commit_message>
<xml_diff>
--- a/Docs/TUBITAK_2209A_Proje_Durumu.docx
+++ b/Docs/TUBITAK_2209A_Proje_Durumu.docx
@@ -36752,6 +36752,214 @@
         <w:t xml:space="preserve">Belge versiyonu: v7 NIHAI - 25 Mayis 2026 - CSV-Sync OK - A4 - Kapak + Icindekiler + 10 bolum + Ek-A (30 gorsel)</w:t>
       </w:r>
     </w:p>
+    <w:p>
+      <w:r>
+        <w:br w:type="page"/>
+      </w:r>
+    </w:p>
+    <w:p>
+      <w:pPr>
+        <w:pStyle w:val="Heading1"/>
+      </w:pPr>
+      <w:r>
+        <w:rPr>
+          <w:b/>
+          <w:color w:val="1E293B"/>
+          <w:sz w:val="36"/>
+        </w:rPr>
+        <w:t>Ek Gorseller ve Analizler</w:t>
+      </w:r>
+    </w:p>
+    <w:p>
+      <w:r>
+        <w:rPr>
+          <w:i/>
+          <w:color w:val="64748B"/>
+          <w:sz w:val="20"/>
+        </w:rPr>
+        <w:t>Ekleme Tarihi: 26 May 2026, 01:19</w:t>
+      </w:r>
+    </w:p>
+    <w:p/>
+    <w:p>
+      <w:pPr>
+        <w:pStyle w:val="Heading2"/>
+      </w:pPr>
+      <w:r>
+        <w:rPr>
+          <w:b/>
+          <w:sz w:val="28"/>
+        </w:rPr>
+        <w:t>Proje Ozet Infografigi</w:t>
+      </w:r>
+    </w:p>
+    <w:p>
+      <w:r>
+        <w:rPr>
+          <w:sz w:val="20"/>
+        </w:rPr>
+        <w:t>Bu gorsel, MC-AWARE projesinin 26 deneyinin (22 ana + 4 faz-2) tum ana bulgularini tek bir sayfada ozetlemektedir. Her kart, bir deney kategorisini (MC Tuzagi Cozumu, Anti-Prediktif Davranis, Mimari Bagimsizlik, Walk-Forward Dogrulama, Klasik ML Negatif Kontrol, Feature Ablasyon, IN_LEN Kirilganlik, Sektorel Kontrast) temsil eder. Alt barda toplam istatistikler (26 deney, 6 DL mimari, 378+ konfigurasyon, 30+ gorsel, 115+ CSV, 7 walk-forward fold) yer almaktadir.</w:t>
+      </w:r>
+    </w:p>
+    <w:p>
+      <w:pPr>
+        <w:jc w:val="center"/>
+      </w:pPr>
+      <w:r>
+        <w:drawing>
+          <wp:inline xmlns:a="http://schemas.openxmlformats.org/drawingml/2006/main" xmlns:pic="http://schemas.openxmlformats.org/drawingml/2006/picture">
+            <wp:extent cx="5486400" cy="3924065"/>
+            <wp:docPr id="2" name="Picture 2"/>
+            <wp:cNvGraphicFramePr>
+              <a:graphicFrameLocks noChangeAspect="1"/>
+            </wp:cNvGraphicFramePr>
+            <a:graphic>
+              <a:graphicData uri="http://schemas.openxmlformats.org/drawingml/2006/picture">
+                <pic:pic>
+                  <pic:nvPicPr>
+                    <pic:cNvPr id="0" name="31_Proje_Ozet_Infografik.png"/>
+                    <pic:cNvPicPr/>
+                  </pic:nvPicPr>
+                  <pic:blipFill>
+                    <a:blip r:embed="rId40"/>
+                    <a:stretch>
+                      <a:fillRect/>
+                    </a:stretch>
+                  </pic:blipFill>
+                  <pic:spPr>
+                    <a:xfrm>
+                      <a:off x="0" y="0"/>
+                      <a:ext cx="5486400" cy="3924065"/>
+                    </a:xfrm>
+                    <a:prstGeom prst="rect"/>
+                  </pic:spPr>
+                </pic:pic>
+              </a:graphicData>
+            </a:graphic>
+          </wp:inline>
+        </w:drawing>
+      </w:r>
+    </w:p>
+    <w:p/>
+    <w:p>
+      <w:pPr>
+        <w:pStyle w:val="Heading2"/>
+      </w:pPr>
+      <w:r>
+        <w:rPr>
+          <w:b/>
+          <w:sz w:val="28"/>
+        </w:rPr>
+        <w:t>Concept Drift Zaman Serisi</w:t>
+      </w:r>
+    </w:p>
+    <w:p>
+      <w:r>
+        <w:rPr>
+          <w:sz w:val="20"/>
+        </w:rPr>
+        <w:t>Ust panel: USDTRY ve Petrol fiyatlarinin THYAO ile olan korelasyonlarinin egitim ve test setleri arasindaki kirilmasini (concept drift) gostermektedir. Kirmizi alan USDTRY, mavi alan Oil degiskeninin train-test korelasyon farkini (drift buyuklugunu) temsil eder. Ozellikle Fold 3-7 arasinda USDTRY korelasyonu dramatik olarak dusmekte, Oil korelasyonu ise isaret degistirmektedir. Alt panel: Her fold icin model dogrulugu (kirmizi), ters-yon dogrulugu (yesil) ve naive baseline (sari) karsilastirilmaktadir. Anti-prediktif foldlar (Fold 1, 2, 6) acik kirmizi arka plan ile isaretlenmistir. Bu grafik, korelasyon kirilmasinin anti-prediktif davranisla zamansal olarak ortusmesini dogrudan gostermektedir.</w:t>
+      </w:r>
+    </w:p>
+    <w:p>
+      <w:pPr>
+        <w:jc w:val="center"/>
+      </w:pPr>
+      <w:r>
+        <w:drawing>
+          <wp:inline xmlns:a="http://schemas.openxmlformats.org/drawingml/2006/main" xmlns:pic="http://schemas.openxmlformats.org/drawingml/2006/picture">
+            <wp:extent cx="5486400" cy="3781225"/>
+            <wp:docPr id="3" name="Picture 3"/>
+            <wp:cNvGraphicFramePr>
+              <a:graphicFrameLocks noChangeAspect="1"/>
+            </wp:cNvGraphicFramePr>
+            <a:graphic>
+              <a:graphicData uri="http://schemas.openxmlformats.org/drawingml/2006/picture">
+                <pic:pic>
+                  <pic:nvPicPr>
+                    <pic:cNvPr id="0" name="32_Concept_Drift_Timeline.png"/>
+                    <pic:cNvPicPr/>
+                  </pic:nvPicPr>
+                  <pic:blipFill>
+                    <a:blip r:embed="rId41"/>
+                    <a:stretch>
+                      <a:fillRect/>
+                    </a:stretch>
+                  </pic:blipFill>
+                  <pic:spPr>
+                    <a:xfrm>
+                      <a:off x="0" y="0"/>
+                      <a:ext cx="5486400" cy="3781225"/>
+                    </a:xfrm>
+                    <a:prstGeom prst="rect"/>
+                  </pic:spPr>
+                </pic:pic>
+              </a:graphicData>
+            </a:graphic>
+          </wp:inline>
+        </w:drawing>
+      </w:r>
+    </w:p>
+    <w:p/>
+    <w:p>
+      <w:pPr>
+        <w:pStyle w:val="Heading2"/>
+      </w:pPr>
+      <w:r>
+        <w:rPr>
+          <w:b/>
+          <w:sz w:val="28"/>
+        </w:rPr>
+        <w:t>Metodoloji Pipeline Akis Semasi</w:t>
+      </w:r>
+    </w:p>
+    <w:p>
+      <w:r>
+        <w:rPr>
+          <w:sz w:val="20"/>
+        </w:rPr>
+        <w:t>MC-AWARE projesinin uctan uca metodoloji akis semasi. Ust satir (Ana Hat): Ham veri toplama (Yahoo Finance, 2014-2023) -&gt; Feature muhendisligi (13 ozellik: 10 teknik indikator + 3 makro degisken) -&gt; MC-Aware on isleme (class_weight=balanced + MC-Aware loss ile lambda tuning) -&gt; Derin ogrenme modelleri (6 mimari: BiLSTM, GRU, Conv1D, TCN, Transformer, RNN) -&gt; Degerlendirme ve analiz (Walk-Forward CV, 7 fold, 5 seed, Flip-Acc metrigi). Alt satir (Dogrulama Katmani): Negatif kontrol (klasik ML baseline) -&gt; Ablasyon testleri (feature, IN_LEN, seed) -&gt; Istatistiksel dogrulama (McNemar, binomial CI) -&gt; Sektorel genelleme (sigorta, holding, NASDAQ) -&gt; Bulgular (anti-prediktif oruntusu, concept drift kaniti, EMH-uyumlu sonuc). Toplam 378+ konfigurasyon, 26 deney, 90/90 MC=0 basarisi.</w:t>
+      </w:r>
+    </w:p>
+    <w:p>
+      <w:pPr>
+        <w:jc w:val="center"/>
+      </w:pPr>
+      <w:r>
+        <w:drawing>
+          <wp:inline xmlns:a="http://schemas.openxmlformats.org/drawingml/2006/main" xmlns:pic="http://schemas.openxmlformats.org/drawingml/2006/picture">
+            <wp:extent cx="5486400" cy="2940535"/>
+            <wp:docPr id="4" name="Picture 4"/>
+            <wp:cNvGraphicFramePr>
+              <a:graphicFrameLocks noChangeAspect="1"/>
+            </wp:cNvGraphicFramePr>
+            <a:graphic>
+              <a:graphicData uri="http://schemas.openxmlformats.org/drawingml/2006/picture">
+                <pic:pic>
+                  <pic:nvPicPr>
+                    <pic:cNvPr id="0" name="33_Metodoloji_Pipeline.png"/>
+                    <pic:cNvPicPr/>
+                  </pic:nvPicPr>
+                  <pic:blipFill>
+                    <a:blip r:embed="rId42"/>
+                    <a:stretch>
+                      <a:fillRect/>
+                    </a:stretch>
+                  </pic:blipFill>
+                  <pic:spPr>
+                    <a:xfrm>
+                      <a:off x="0" y="0"/>
+                      <a:ext cx="5486400" cy="2940535"/>
+                    </a:xfrm>
+                    <a:prstGeom prst="rect"/>
+                  </pic:spPr>
+                </pic:pic>
+              </a:graphicData>
+            </a:graphic>
+          </wp:inline>
+        </w:drawing>
+      </w:r>
+    </w:p>
     <w:sectPr>
       <w:headerReference w:type="default" r:id="rId7"/>
       <w:footerReference w:type="default" r:id="rId8"/>
@@ -37279,59 +37487,5 @@
       <w:szCs w:val="20"/>
     </w:rPr>
   </w:style>
-  <w:style w:type="paragraph" w:styleId="Heading1">
-    <w:name w:val="Heading 1"/>
-    <w:basedOn w:val="Normal"/>
-    <w:next w:val="Normal"/>
-    <w:qFormat/>
-    <w:pPr>
-      <w:spacing w:after="0" w:before="0"/>
-      <w:outlineLvl w:val="0"/>
-    </w:pPr>
-    <w:rPr>
-      <w:rFonts w:ascii="Cambria" w:cs="Cambria" w:eastAsia="Cambria" w:hAnsi="Cambria"/>
-      <w:b/>
-      <w:bCs/>
-      <w:color w:val="FFFFFF"/>
-      <w:sz w:val="4"/>
-      <w:szCs w:val="4"/>
-    </w:rPr>
-  </w:style>
-  <w:style w:type="paragraph" w:styleId="Heading2">
-    <w:name w:val="Heading 2"/>
-    <w:basedOn w:val="Normal"/>
-    <w:next w:val="Normal"/>
-    <w:qFormat/>
-    <w:pPr>
-      <w:spacing w:after="140" w:before="360"/>
-      <w:outlineLvl w:val="1"/>
-    </w:pPr>
-    <w:rPr>
-      <w:rFonts w:ascii="Cambria" w:cs="Cambria" w:eastAsia="Cambria" w:hAnsi="Cambria"/>
-      <w:b/>
-      <w:bCs/>
-      <w:color w:val="0B2545"/>
-      <w:sz w:val="28"/>
-      <w:szCs w:val="28"/>
-    </w:rPr>
-  </w:style>
-  <w:style w:type="paragraph" w:styleId="Heading3">
-    <w:name w:val="Heading 3"/>
-    <w:basedOn w:val="Normal"/>
-    <w:next w:val="Normal"/>
-    <w:qFormat/>
-    <w:pPr>
-      <w:spacing w:after="100" w:before="260"/>
-      <w:outlineLvl w:val="2"/>
-    </w:pPr>
-    <w:rPr>
-      <w:rFonts w:ascii="Cambria" w:cs="Cambria" w:eastAsia="Cambria" w:hAnsi="Cambria"/>
-      <w:b/>
-      <w:bCs/>
-      <w:color w:val="13315C"/>
-      <w:sz w:val="24"/>
-      <w:szCs w:val="24"/>
-    </w:rPr>
-  </w:style>
 </w:styles>
 </file>
</xml_diff>